<commit_message>
Complete the development of the fixed monthly expense management interface by utilizing APIs, ensuring proper functionality and a professional design. webpart is done, for the next..
</commit_message>
<xml_diff>
--- a/Preliminary_Study/Système de Gestion Financière.docx
+++ b/Preliminary_Study/Système de Gestion Financière.docx
@@ -546,7 +546,7 @@
     <w:p>
       <w:r>
         <w:pict w14:anchorId="506F06BB">
-          <v:rect id="_x0000_i1049" style="width:0;height:1.5pt" o:hralign="center" o:hrstd="t" o:hr="t" fillcolor="#a0a0a0" stroked="f"/>
+          <v:rect id="_x0000_i1025" style="width:0;height:1.5pt" o:hralign="center" o:hrstd="t" o:hr="t" fillcolor="#a0a0a0" stroked="f"/>
         </w:pict>
       </w:r>
     </w:p>
@@ -677,7 +677,7 @@
     <w:p>
       <w:r>
         <w:pict w14:anchorId="1EEE5474">
-          <v:rect id="_x0000_i1044" style="width:0;height:1.5pt" o:hralign="center" o:hrstd="t" o:hr="t" fillcolor="#a0a0a0" stroked="f"/>
+          <v:rect id="_x0000_i1026" style="width:0;height:1.5pt" o:hralign="center" o:hrstd="t" o:hr="t" fillcolor="#a0a0a0" stroked="f"/>
         </w:pict>
       </w:r>
     </w:p>
@@ -851,7 +851,7 @@
     <w:p>
       <w:r>
         <w:pict w14:anchorId="382ABC02">
-          <v:rect id="_x0000_i1045" style="width:0;height:1.5pt" o:hralign="center" o:hrstd="t" o:hr="t" fillcolor="#a0a0a0" stroked="f"/>
+          <v:rect id="_x0000_i1027" style="width:0;height:1.5pt" o:hralign="center" o:hrstd="t" o:hr="t" fillcolor="#a0a0a0" stroked="f"/>
         </w:pict>
       </w:r>
     </w:p>
@@ -969,7 +969,7 @@
     <w:p>
       <w:r>
         <w:pict w14:anchorId="056FC160">
-          <v:rect id="_x0000_i1116" style="width:0;height:1.5pt" o:hralign="center" o:hrstd="t" o:hr="t" fillcolor="#a0a0a0" stroked="f"/>
+          <v:rect id="_x0000_i1028" style="width:0;height:1.5pt" o:hralign="center" o:hrstd="t" o:hr="t" fillcolor="#a0a0a0" stroked="f"/>
         </w:pict>
       </w:r>
     </w:p>
@@ -990,7 +990,11 @@
         <w:t xml:space="preserve"> de ton entreprise :</w:t>
       </w:r>
     </w:p>
-    <w:p/>
+    <w:p>
+      <w:r>
+        <w:t xml:space="preserve"> </w:t>
+      </w:r>
+    </w:p>
     <w:p>
       <w:pPr>
         <w:rPr>
@@ -1144,7 +1148,7 @@
     <w:p>
       <w:r>
         <w:pict w14:anchorId="1D86C85B">
-          <v:rect id="_x0000_i1076" style="width:0;height:1.5pt" o:hralign="center" o:hrstd="t" o:hr="t" fillcolor="#a0a0a0" stroked="f"/>
+          <v:rect id="_x0000_i1029" style="width:0;height:1.5pt" o:hralign="center" o:hrstd="t" o:hr="t" fillcolor="#a0a0a0" stroked="f"/>
         </w:pict>
       </w:r>
     </w:p>
@@ -1293,7 +1297,7 @@
     <w:p>
       <w:r>
         <w:pict w14:anchorId="56C10E1E">
-          <v:rect id="_x0000_i1077" style="width:0;height:1.5pt" o:hralign="center" o:hrstd="t" o:hr="t" fillcolor="#a0a0a0" stroked="f"/>
+          <v:rect id="_x0000_i1030" style="width:0;height:1.5pt" o:hralign="center" o:hrstd="t" o:hr="t" fillcolor="#a0a0a0" stroked="f"/>
         </w:pict>
       </w:r>
     </w:p>
@@ -1718,7 +1722,7 @@
     <w:p>
       <w:r>
         <w:pict w14:anchorId="4747848B">
-          <v:rect id="_x0000_i1078" style="width:0;height:1.5pt" o:hralign="center" o:hrstd="t" o:hr="t" fillcolor="#a0a0a0" stroked="f"/>
+          <v:rect id="_x0000_i1031" style="width:0;height:1.5pt" o:hralign="center" o:hrstd="t" o:hr="t" fillcolor="#a0a0a0" stroked="f"/>
         </w:pict>
       </w:r>
     </w:p>
@@ -1814,7 +1818,7 @@
     <w:p>
       <w:r>
         <w:pict w14:anchorId="63245A35">
-          <v:rect id="_x0000_i1115" style="width:0;height:1.5pt" o:hralign="center" o:hrstd="t" o:hr="t" fillcolor="#a0a0a0" stroked="f"/>
+          <v:rect id="_x0000_i1032" style="width:0;height:1.5pt" o:hralign="center" o:hrstd="t" o:hr="t" fillcolor="#a0a0a0" stroked="f"/>
         </w:pict>
       </w:r>
     </w:p>
@@ -2084,7 +2088,7 @@
     <w:p>
       <w:r>
         <w:pict w14:anchorId="334A06E8">
-          <v:rect id="_x0000_i1108" style="width:0;height:1.5pt" o:hralign="center" o:hrstd="t" o:hr="t" fillcolor="#a0a0a0" stroked="f"/>
+          <v:rect id="_x0000_i1033" style="width:0;height:1.5pt" o:hralign="center" o:hrstd="t" o:hr="t" fillcolor="#a0a0a0" stroked="f"/>
         </w:pict>
       </w:r>
     </w:p>
@@ -2287,7 +2291,7 @@
     <w:p>
       <w:r>
         <w:pict w14:anchorId="39F7C3A7">
-          <v:rect id="_x0000_i1109" style="width:0;height:1.5pt" o:hralign="center" o:hrstd="t" o:hr="t" fillcolor="#a0a0a0" stroked="f"/>
+          <v:rect id="_x0000_i1034" style="width:0;height:1.5pt" o:hralign="center" o:hrstd="t" o:hr="t" fillcolor="#a0a0a0" stroked="f"/>
         </w:pict>
       </w:r>
     </w:p>
@@ -2435,7 +2439,7 @@
     <w:p>
       <w:r>
         <w:pict w14:anchorId="584C6AA0">
-          <v:rect id="_x0000_i1121" style="width:0;height:1.5pt" o:hralign="center" o:hrstd="t" o:hr="t" fillcolor="#a0a0a0" stroked="f"/>
+          <v:rect id="_x0000_i1035" style="width:0;height:1.5pt" o:hralign="center" o:hrstd="t" o:hr="t" fillcolor="#a0a0a0" stroked="f"/>
         </w:pict>
       </w:r>
     </w:p>
@@ -4195,6 +4199,7 @@
   <w:style w:type="character" w:default="1" w:styleId="Policepardfaut">
     <w:name w:val="Default Paragraph Font"/>
     <w:uiPriority w:val="1"/>
+    <w:semiHidden/>
     <w:unhideWhenUsed/>
   </w:style>
   <w:style w:type="table" w:default="1" w:styleId="TableauNormal">

</xml_diff>